<commit_message>
Describe the app as localhost-only and drop hosting platform names from the docs
Co-Authored-By: Claude Opus 5.5 <noreply@anthropic.com>
</commit_message>
<xml_diff>
--- a/docs/Reward360 Warehouse - Project Overview.docx
+++ b/docs/Reward360 Warehouse - Project Overview.docx
@@ -75,43 +75,7 @@
         <w:pStyle w:val="FirstParagraph"/>
       </w:pPr>
       <w:r>
-        <w:t xml:space="preserve">Reward360’s warehouse receives goods from vendors and sends packed orders out to</w:t>
-      </w:r>
-      <w:r>
-        <w:t xml:space="preserve"> </w:t>
-      </w:r>
-      <w:r>
-        <w:t xml:space="preserve">customers. Before this system, that journey depended on paper, memory and trust:</w:t>
-      </w:r>
-      <w:r>
-        <w:t xml:space="preserve"> </w:t>
-      </w:r>
-      <w:r>
-        <w:t xml:space="preserve">a guard wrote a truck number in a register, someone counted boxes, someone else</w:t>
-      </w:r>
-      <w:r>
-        <w:t xml:space="preserve"> </w:t>
-      </w:r>
-      <w:r>
-        <w:t xml:space="preserve">packed an order, and if a count was wrong nobody could say for certain where it</w:t>
-      </w:r>
-      <w:r>
-        <w:t xml:space="preserve"> </w:t>
-      </w:r>
-      <w:r>
-        <w:t xml:space="preserve">went wrong or who was standing there when it happened. This application replaces</w:t>
-      </w:r>
-      <w:r>
-        <w:t xml:space="preserve"> </w:t>
-      </w:r>
-      <w:r>
-        <w:t xml:space="preserve">that with a single tracked process, from the moment a truck stops at the gate to</w:t>
-      </w:r>
-      <w:r>
-        <w:t xml:space="preserve"> </w:t>
-      </w:r>
-      <w:r>
-        <w:t xml:space="preserve">the moment a different truck drives out with packed cartons.</w:t>
+        <w:t xml:space="preserve">Reward360’s warehouse receives goods from vendors and sends packed orders out to customers. Before this system, that journey depended on paper, memory and trust: a guard wrote a truck number in a register, someone counted boxes, someone else packed an order, and if a count was wrong nobody could say for certain where it went wrong or who was standing there when it happened. This application replaces that with a single tracked process, from the moment a truck stops at the gate to the moment a different truck drives out with packed cartons.</w:t>
       </w:r>
     </w:p>
     <w:bookmarkEnd w:id="9"/>
@@ -133,21 +97,7 @@
           <w:b/>
           <w:bCs/>
         </w:rPr>
-        <w:t xml:space="preserve">Nothing moves without being counted, and every count belongs to a named person</w:t>
-      </w:r>
-      <w:r>
-        <w:rPr>
-          <w:b/>
-          <w:bCs/>
-        </w:rPr>
-        <w:t xml:space="preserve"> </w:t>
-      </w:r>
-      <w:r>
-        <w:rPr>
-          <w:b/>
-          <w:bCs/>
-        </w:rPr>
-        <w:t xml:space="preserve">at a recorded time.</w:t>
+        <w:t xml:space="preserve">Nothing moves without being counted, and every count belongs to a named person at a recorded time.</w:t>
       </w:r>
     </w:p>
     <w:p>
@@ -155,43 +105,7 @@
         <w:pStyle w:val="BodyText"/>
       </w:pPr>
       <w:r>
-        <w:t xml:space="preserve">That sounds like a policy. In this system it is a fact, because the checks are</w:t>
-      </w:r>
-      <w:r>
-        <w:t xml:space="preserve"> </w:t>
-      </w:r>
-      <w:r>
-        <w:t xml:space="preserve">not polite reminders on a screen — they are enforced in the database itself. A</w:t>
-      </w:r>
-      <w:r>
-        <w:t xml:space="preserve"> </w:t>
-      </w:r>
-      <w:r>
-        <w:t xml:space="preserve">user cannot click past them, a developer cannot switch them off from the app,</w:t>
-      </w:r>
-      <w:r>
-        <w:t xml:space="preserve"> </w:t>
-      </w:r>
-      <w:r>
-        <w:t xml:space="preserve">and no</w:t>
-      </w:r>
-      <w:r>
-        <w:t xml:space="preserve"> </w:t>
-      </w:r>
-      <w:r>
-        <w:t xml:space="preserve">“manual override”</w:t>
-      </w:r>
-      <w:r>
-        <w:t xml:space="preserve"> </w:t>
-      </w:r>
-      <w:r>
-        <w:t xml:space="preserve">button exists anywhere in the product. If a count does</w:t>
-      </w:r>
-      <w:r>
-        <w:t xml:space="preserve"> </w:t>
-      </w:r>
-      <w:r>
-        <w:t xml:space="preserve">not match, the next step simply does not happen.</w:t>
+        <w:t xml:space="preserve">That sounds like a policy. In this system it is a fact, because the checks are not polite reminders on a screen — they are enforced in the database itself. A user cannot click past them, a developer cannot switch them off from the app, and no “manual override” button exists anywhere in the product. If a count does not match, the next step simply does not happen.</w:t>
       </w:r>
     </w:p>
     <w:bookmarkEnd w:id="10"/>
@@ -393,22 +307,7 @@
         <w:t xml:space="preserve">The entire process is built and working.</w:t>
       </w:r>
       <w:r>
-        <w:t xml:space="preserve"> </w:t>
-      </w:r>
-      <w:r>
-        <w:t xml:space="preserve">Not a prototype of part of it: the</w:t>
-      </w:r>
-      <w:r>
-        <w:t xml:space="preserve"> </w:t>
-      </w:r>
-      <w:r>
-        <w:t xml:space="preserve">complete path, gate to gate, has been walked end to end by real users and by</w:t>
-      </w:r>
-      <w:r>
-        <w:t xml:space="preserve"> </w:t>
-      </w:r>
-      <w:r>
-        <w:t xml:space="preserve">automated tests that drive the real application over the network.</w:t>
+        <w:t xml:space="preserve"> Not a prototype of part of it: the complete path, gate to gate, has been walked end to end by real users and by automated tests that drive the real application over the network.</w:t>
       </w:r>
     </w:p>
     <w:p>
@@ -647,22 +546,7 @@
         <w:t xml:space="preserve">Eleven hard stops are enforced by the database.</w:t>
       </w:r>
       <w:r>
-        <w:t xml:space="preserve"> </w:t>
-      </w:r>
-      <w:r>
-        <w:t xml:space="preserve">These are the points where</w:t>
-      </w:r>
-      <w:r>
-        <w:t xml:space="preserve"> </w:t>
-      </w:r>
-      <w:r>
-        <w:t xml:space="preserve">the system physically refuses to continue. They are described in plain language</w:t>
-      </w:r>
-      <w:r>
-        <w:t xml:space="preserve"> </w:t>
-      </w:r>
-      <w:r>
-        <w:t xml:space="preserve">in section 5.</w:t>
+        <w:t xml:space="preserve"> These are the points where the system physically refuses to continue. They are described in plain language in section 5.</w:t>
       </w:r>
     </w:p>
     <w:p>
@@ -677,22 +561,7 @@
         <w:t xml:space="preserve">Quality:</w:t>
       </w:r>
       <w:r>
-        <w:t xml:space="preserve"> </w:t>
-      </w:r>
-      <w:r>
-        <w:t xml:space="preserve">167 automated tests plus four full end-to-end walkthroughs (122,</w:t>
-      </w:r>
-      <w:r>
-        <w:t xml:space="preserve"> </w:t>
-      </w:r>
-      <w:r>
-        <w:t xml:space="preserve">582, 40 and 14 individual checks) run against a real database and a real running</w:t>
-      </w:r>
-      <w:r>
-        <w:t xml:space="preserve"> </w:t>
-      </w:r>
-      <w:r>
-        <w:t xml:space="preserve">copy of the application.</w:t>
+        <w:t xml:space="preserve"> 167 automated tests plus four full end-to-end walkthroughs (122, 582, 40 and 14 individual checks) run against a real database and a real running copy of the application.</w:t>
       </w:r>
     </w:p>
     <w:p>
@@ -725,25 +594,7 @@
         <w:pStyle w:val="FirstParagraph"/>
       </w:pPr>
       <w:r>
-        <w:t xml:space="preserve">Everyone signs in with their own account. Each person sees only the screens that</w:t>
-      </w:r>
-      <w:r>
-        <w:t xml:space="preserve"> </w:t>
-      </w:r>
-      <w:r>
-        <w:t xml:space="preserve">belong to their job: a security guard cannot open the reports, and a packer</w:t>
-      </w:r>
-      <w:r>
-        <w:t xml:space="preserve"> </w:t>
-      </w:r>
-      <w:r>
-        <w:t xml:space="preserve">cannot approve a truck at the gate. This is checked three separate times — when</w:t>
-      </w:r>
-      <w:r>
-        <w:t xml:space="preserve"> </w:t>
-      </w:r>
-      <w:r>
-        <w:t xml:space="preserve">the menu is drawn, when the button is pressed, and again inside the database.</w:t>
+        <w:t xml:space="preserve">Everyone signs in with their own account. Each person sees only the screens that belong to their job: a security guard cannot open the reports, and a packer cannot approve a truck at the gate. This is checked three separate times — when the menu is drawn, when the button is pressed, and again inside the database.</w:t>
       </w:r>
     </w:p>
     <w:bookmarkStart w:id="14" w:name="security-guard"/>
@@ -772,13 +623,7 @@
         </w:numPr>
       </w:pPr>
       <w:r>
-        <w:t xml:space="preserve">Registers everyone arriving: driver, labourers, mobile numbers, vehicle</w:t>
-      </w:r>
-      <w:r>
-        <w:t xml:space="preserve"> </w:t>
-      </w:r>
-      <w:r>
-        <w:t xml:space="preserve">number, vendor and purchase order</w:t>
+        <w:t xml:space="preserve">Registers everyone arriving: driver, labourers, mobile numbers, vehicle number, vendor and purchase order</w:t>
       </w:r>
     </w:p>
     <w:p>
@@ -790,19 +635,7 @@
         </w:numPr>
       </w:pPr>
       <w:r>
-        <w:t xml:space="preserve">Photographs identity documents — but only on a person’s first visit. A driver</w:t>
-      </w:r>
-      <w:r>
-        <w:t xml:space="preserve"> </w:t>
-      </w:r>
-      <w:r>
-        <w:t xml:space="preserve">who has been here before is recognised and not asked again (the photo is</w:t>
-      </w:r>
-      <w:r>
-        <w:t xml:space="preserve"> </w:t>
-      </w:r>
-      <w:r>
-        <w:t xml:space="preserve">re-taken after 180 days)</w:t>
+        <w:t xml:space="preserve">Photographs identity documents — but only on a person’s first visit. A driver who has been here before is recognised and not asked again (the photo is re-taken after 180 days)</w:t>
       </w:r>
     </w:p>
     <w:p>
@@ -821,16 +654,7 @@
         <w:t xml:space="preserve">Cannot open the gate alone.</w:t>
       </w:r>
       <w:r>
-        <w:t xml:space="preserve"> </w:t>
-      </w:r>
-      <w:r>
-        <w:t xml:space="preserve">The request goes for approval and the gate</w:t>
-      </w:r>
-      <w:r>
-        <w:t xml:space="preserve"> </w:t>
-      </w:r>
-      <w:r>
-        <w:t xml:space="preserve">stays locked until someone else approves it</w:t>
+        <w:t xml:space="preserve"> The request goes for approval and the gate stays locked until someone else approves it</w:t>
       </w:r>
     </w:p>
     <w:p>
@@ -854,19 +678,7 @@
         </w:numPr>
       </w:pPr>
       <w:r>
-        <w:t xml:space="preserve">On the way out: counts the cartons on the loading bay, registers the</w:t>
-      </w:r>
-      <w:r>
-        <w:t xml:space="preserve"> </w:t>
-      </w:r>
-      <w:r>
-        <w:t xml:space="preserve">collecting vehicle, scans each carton onto it, asks permission to leave, and</w:t>
-      </w:r>
-      <w:r>
-        <w:t xml:space="preserve"> </w:t>
-      </w:r>
-      <w:r>
-        <w:t xml:space="preserve">finally opens the gate</w:t>
+        <w:t xml:space="preserve">On the way out: counts the cartons on the loading bay, registers the collecting vehicle, scans each carton onto it, asks permission to leave, and finally opens the gate</w:t>
       </w:r>
     </w:p>
     <w:p>
@@ -998,13 +810,7 @@
         </w:numPr>
       </w:pPr>
       <w:r>
-        <w:t xml:space="preserve">If their number and the warehouse’s number disagree, the truck’s paperwork</w:t>
-      </w:r>
-      <w:r>
-        <w:t xml:space="preserve"> </w:t>
-      </w:r>
-      <w:r>
-        <w:t xml:space="preserve">stays open and a problem is raised. This is the last step of receiving</w:t>
+        <w:t xml:space="preserve">If their number and the warehouse’s number disagree, the truck’s paperwork stays open and a problem is raised. This is the last step of receiving</w:t>
       </w:r>
     </w:p>
     <w:bookmarkEnd w:id="16"/>
@@ -1026,13 +832,7 @@
         </w:numPr>
       </w:pPr>
       <w:r>
-        <w:t xml:space="preserve">Photographs a printed invoice; the app reads the order number off it</w:t>
-      </w:r>
-      <w:r>
-        <w:t xml:space="preserve"> </w:t>
-      </w:r>
-      <w:r>
-        <w:t xml:space="preserve">automatically and creates the invoice record</w:t>
+        <w:t xml:space="preserve">Photographs a printed invoice; the app reads the order number off it automatically and creates the invoice record</w:t>
       </w:r>
     </w:p>
     <w:p>
@@ -1044,10 +844,7 @@
         </w:numPr>
       </w:pPr>
       <w:r>
-        <w:t xml:space="preserve">Hands the carton to a packing lady by scanning</w:t>
-      </w:r>
-      <w:r>
-        <w:t xml:space="preserve"> </w:t>
+        <w:t xml:space="preserve">Hands the carton to a packing lady by scanning </w:t>
       </w:r>
       <w:r>
         <w:rPr>
@@ -1057,16 +854,7 @@
         <w:t xml:space="preserve">her</w:t>
       </w:r>
       <w:r>
-        <w:t xml:space="preserve"> </w:t>
-      </w:r>
-      <w:r>
-        <w:t xml:space="preserve">badge — that handover</w:t>
-      </w:r>
-      <w:r>
-        <w:t xml:space="preserve"> </w:t>
-      </w:r>
-      <w:r>
-        <w:t xml:space="preserve">is what makes two different people responsible for the order</w:t>
+        <w:t xml:space="preserve"> badge — that handover is what makes two different people responsible for the order</w:t>
       </w:r>
     </w:p>
     <w:bookmarkEnd w:id="17"/>
@@ -1100,16 +888,7 @@
         </w:numPr>
       </w:pPr>
       <w:r>
-        <w:t xml:space="preserve">At despatch: receives a carton assigned to her, scans each product box into</w:t>
-      </w:r>
-      <w:r>
-        <w:t xml:space="preserve"> </w:t>
-      </w:r>
-      <w:r>
-        <w:t xml:space="preserve">it, and confirms with</w:t>
-      </w:r>
-      <w:r>
-        <w:t xml:space="preserve"> </w:t>
+        <w:t xml:space="preserve">At despatch: receives a carton assigned to her, scans each product box into it, and confirms with </w:t>
       </w:r>
       <w:r>
         <w:rPr>
@@ -1119,10 +898,7 @@
         <w:t xml:space="preserve">her own</w:t>
       </w:r>
       <w:r>
-        <w:t xml:space="preserve"> </w:t>
-      </w:r>
-      <w:r>
-        <w:t xml:space="preserve">badge</w:t>
+        <w:t xml:space="preserve"> badge</w:t>
       </w:r>
     </w:p>
     <w:p>
@@ -1141,16 +917,7 @@
         <w:t xml:space="preserve">The rule she cannot get around:</w:t>
       </w:r>
       <w:r>
-        <w:t xml:space="preserve"> </w:t>
-      </w:r>
-      <w:r>
-        <w:t xml:space="preserve">the person who verified the invoice and</w:t>
-      </w:r>
-      <w:r>
-        <w:t xml:space="preserve"> </w:t>
-      </w:r>
-      <w:r>
-        <w:t xml:space="preserve">the person who packs it must be two different people</w:t>
+        <w:t xml:space="preserve"> the person who verified the invoice and the person who packs it must be two different people</w:t>
       </w:r>
     </w:p>
     <w:bookmarkEnd w:id="18"/>
@@ -1208,13 +975,7 @@
         </w:numPr>
       </w:pPr>
       <w:r>
-        <w:t xml:space="preserve">Can open every operational screen, so the warehouse does not stop when</w:t>
-      </w:r>
-      <w:r>
-        <w:t xml:space="preserve"> </w:t>
-      </w:r>
-      <w:r>
-        <w:t xml:space="preserve">somebody is on leave</w:t>
+        <w:t xml:space="preserve">Can open every operational screen, so the warehouse does not stop when somebody is on leave</w:t>
       </w:r>
     </w:p>
     <w:p>
@@ -1238,49 +999,7 @@
           <w:i/>
           <w:iCs/>
         </w:rPr>
-        <w:t xml:space="preserve">(A seventh role, Warehouse Staff, existed for shelf putaway. That step was</w:t>
-      </w:r>
-      <w:r>
-        <w:rPr>
-          <w:i/>
-          <w:iCs/>
-        </w:rPr>
-        <w:t xml:space="preserve"> </w:t>
-      </w:r>
-      <w:r>
-        <w:rPr>
-          <w:i/>
-          <w:iCs/>
-        </w:rPr>
-        <w:t xml:space="preserve">removed at the business’s request — the app no longer tracks which rack goods</w:t>
-      </w:r>
-      <w:r>
-        <w:rPr>
-          <w:i/>
-          <w:iCs/>
-        </w:rPr>
-        <w:t xml:space="preserve"> </w:t>
-      </w:r>
-      <w:r>
-        <w:rPr>
-          <w:i/>
-          <w:iCs/>
-        </w:rPr>
-        <w:t xml:space="preserve">sit on — so the role now grants nothing. Existing accounts can still sign in and</w:t>
-      </w:r>
-      <w:r>
-        <w:rPr>
-          <w:i/>
-          <w:iCs/>
-        </w:rPr>
-        <w:t xml:space="preserve"> </w:t>
-      </w:r>
-      <w:r>
-        <w:rPr>
-          <w:i/>
-          <w:iCs/>
-        </w:rPr>
-        <w:t xml:space="preserve">see their own profile until an Admin reassigns them.)</w:t>
+        <w:t xml:space="preserve">(A seventh role, Warehouse Staff, existed for shelf putaway. That step was removed at the business’s request — the app no longer tracks which rack goods sit on — so the role now grants nothing. Existing accounts can still sign in and see their own profile until an Admin reassigns them.)</w:t>
       </w:r>
     </w:p>
     <w:p>
@@ -1322,31 +1041,7 @@
         <w:t xml:space="preserve">Step 1 — The guard registers the truck.</w:t>
       </w:r>
       <w:r>
-        <w:t xml:space="preserve"> </w:t>
-      </w:r>
-      <w:r>
-        <w:t xml:space="preserve">Driver’s name and mobile, the labourers with him, the vehicle number, which</w:t>
-      </w:r>
-      <w:r>
-        <w:t xml:space="preserve"> </w:t>
-      </w:r>
-      <w:r>
-        <w:t xml:space="preserve">vendor it is from and which purchase order it is against. If any of these people</w:t>
-      </w:r>
-      <w:r>
-        <w:t xml:space="preserve"> </w:t>
-      </w:r>
-      <w:r>
-        <w:t xml:space="preserve">have never been here before, the guard photographs their ID. Then the guard</w:t>
-      </w:r>
-      <w:r>
-        <w:t xml:space="preserve"> </w:t>
-      </w:r>
-      <w:r>
-        <w:t xml:space="preserve">sends the entry for approval.</w:t>
-      </w:r>
-      <w:r>
-        <w:t xml:space="preserve"> </w:t>
+        <w:t xml:space="preserve"> Driver’s name and mobile, the labourers with him, the vehicle number, which vendor it is from and which purchase order it is against. If any of these people have never been here before, the guard photographs their ID. Then the guard sends the entry for approval. </w:t>
       </w:r>
       <w:r>
         <w:rPr>
@@ -1368,76 +1063,24 @@
         <w:t xml:space="preserve">Step 2 — Someone else approves it.</w:t>
       </w:r>
       <w:r>
-        <w:t xml:space="preserve"> </w:t>
-      </w:r>
-      <w:r>
-        <w:t xml:space="preserve">An Ops Manager or Admin opens Approvals and decides.</w:t>
-      </w:r>
-      <w:r>
-        <w:t xml:space="preserve"> </w:t>
-      </w:r>
-      <w:r>
-        <w:rPr>
-          <w:b/>
-          <w:bCs/>
-        </w:rPr>
-        <w:t xml:space="preserve">The guard who filed the</w:t>
-      </w:r>
-      <w:r>
-        <w:rPr>
-          <w:b/>
-          <w:bCs/>
-        </w:rPr>
-        <w:t xml:space="preserve"> </w:t>
-      </w:r>
-      <w:r>
-        <w:rPr>
-          <w:b/>
-          <w:bCs/>
-        </w:rPr>
-        <w:t xml:space="preserve">request cannot approve it</w:t>
-      </w:r>
-      <w:r>
-        <w:t xml:space="preserve"> </w:t>
-      </w:r>
-      <w:r>
-        <w:t xml:space="preserve">— the system refuses, by design. If nobody responds,</w:t>
-      </w:r>
-      <w:r>
-        <w:t xml:space="preserve"> </w:t>
-      </w:r>
-      <w:r>
-        <w:t xml:space="preserve">it re-alerts after 15 minutes naming the backup approver, and again after 30</w:t>
-      </w:r>
-      <w:r>
-        <w:t xml:space="preserve"> </w:t>
-      </w:r>
-      <w:r>
-        <w:t xml:space="preserve">minutes, marking the entry as breaching its response time.</w:t>
-      </w:r>
-      <w:r>
-        <w:t xml:space="preserve"> </w:t>
-      </w:r>
-      <w:r>
-        <w:rPr>
-          <w:b/>
-          <w:bCs/>
-        </w:rPr>
-        <w:t xml:space="preserve">It never approves</w:t>
-      </w:r>
-      <w:r>
-        <w:rPr>
-          <w:b/>
-          <w:bCs/>
-        </w:rPr>
-        <w:t xml:space="preserve"> </w:t>
-      </w:r>
-      <w:r>
-        <w:rPr>
-          <w:b/>
-          <w:bCs/>
-        </w:rPr>
-        <w:t xml:space="preserve">itself.</w:t>
+        <w:t xml:space="preserve"> An Ops Manager or Admin opens Approvals and decides. </w:t>
+      </w:r>
+      <w:r>
+        <w:rPr>
+          <w:b/>
+          <w:bCs/>
+        </w:rPr>
+        <w:t xml:space="preserve">The guard who filed the request cannot approve it</w:t>
+      </w:r>
+      <w:r>
+        <w:t xml:space="preserve"> — the system refuses, by design. If nobody responds, it re-alerts after 15 minutes naming the backup approver, and again after 30 minutes, marking the entry as breaching its response time. </w:t>
+      </w:r>
+      <w:r>
+        <w:rPr>
+          <w:b/>
+          <w:bCs/>
+        </w:rPr>
+        <w:t xml:space="preserve">It never approves itself.</w:t>
       </w:r>
     </w:p>
     <w:p>
@@ -1452,10 +1095,7 @@
         <w:t xml:space="preserve">Step 3 — The gate opens.</w:t>
       </w:r>
       <w:r>
-        <w:t xml:space="preserve"> </w:t>
-      </w:r>
-      <w:r>
-        <w:t xml:space="preserve">The time in is stamped automatically.</w:t>
+        <w:t xml:space="preserve"> The time in is stamped automatically.</w:t>
       </w:r>
     </w:p>
     <w:p>
@@ -1470,10 +1110,7 @@
         <w:t xml:space="preserve">Step 4 — The guard counts the big boxes.</w:t>
       </w:r>
       <w:r>
-        <w:t xml:space="preserve"> </w:t>
-      </w:r>
-      <w:r>
-        <w:t xml:space="preserve">He looks at the truck and enters how many boxes are on it.</w:t>
+        <w:t xml:space="preserve"> He looks at the truck and enters how many boxes are on it.</w:t>
       </w:r>
     </w:p>
     <w:p>
@@ -1488,13 +1125,7 @@
         <w:t xml:space="preserve">Step 5 — Stickers are printed.</w:t>
       </w:r>
       <w:r>
-        <w:t xml:space="preserve"> </w:t>
-      </w:r>
-      <w:r>
-        <w:t xml:space="preserve">The system generates</w:t>
-      </w:r>
-      <w:r>
-        <w:t xml:space="preserve"> </w:t>
+        <w:t xml:space="preserve"> The system generates </w:t>
       </w:r>
       <w:r>
         <w:rPr>
@@ -1504,16 +1135,7 @@
         <w:t xml:space="preserve">exactly</w:t>
       </w:r>
       <w:r>
-        <w:t xml:space="preserve"> </w:t>
-      </w:r>
-      <w:r>
-        <w:t xml:space="preserve">that many QR stickers — not one more — and prints</w:t>
-      </w:r>
-      <w:r>
-        <w:t xml:space="preserve"> </w:t>
-      </w:r>
-      <w:r>
-        <w:t xml:space="preserve">them as a sheet.</w:t>
+        <w:t xml:space="preserve"> that many QR stickers — not one more — and prints them as a sheet.</w:t>
       </w:r>
     </w:p>
     <w:p>
@@ -1528,13 +1150,7 @@
         <w:t xml:space="preserve">Step 6 — Every box is stickered and scanned.</w:t>
       </w:r>
       <w:r>
-        <w:t xml:space="preserve"> </w:t>
-      </w:r>
-      <w:r>
-        <w:t xml:space="preserve">A packer sticks one on each box and scans it.</w:t>
-      </w:r>
-      <w:r>
-        <w:t xml:space="preserve"> </w:t>
+        <w:t xml:space="preserve"> A packer sticks one on each box and scans it. </w:t>
       </w:r>
       <w:r>
         <w:rPr>
@@ -1544,22 +1160,7 @@
         <w:t xml:space="preserve">Stop:</w:t>
       </w:r>
       <w:r>
-        <w:t xml:space="preserve"> </w:t>
-      </w:r>
-      <w:r>
-        <w:t xml:space="preserve">the number scanned must</w:t>
-      </w:r>
-      <w:r>
-        <w:t xml:space="preserve"> </w:t>
-      </w:r>
-      <w:r>
-        <w:t xml:space="preserve">equal the number issued. Scanning the same sticker twice is rejected outright,</w:t>
-      </w:r>
-      <w:r>
-        <w:t xml:space="preserve"> </w:t>
-      </w:r>
-      <w:r>
-        <w:t xml:space="preserve">not counted again.</w:t>
+        <w:t xml:space="preserve"> the number scanned must equal the number issued. Scanning the same sticker twice is rejected outright, not counted again.</w:t>
       </w:r>
     </w:p>
     <w:p>
@@ -1574,16 +1175,7 @@
         <w:t xml:space="preserve">Step 7 — Unit stickers.</w:t>
       </w:r>
       <w:r>
-        <w:t xml:space="preserve"> </w:t>
-      </w:r>
-      <w:r>
-        <w:t xml:space="preserve">The system prints one sticker per individual product, worked out from the</w:t>
-      </w:r>
-      <w:r>
-        <w:t xml:space="preserve"> </w:t>
-      </w:r>
-      <w:r>
-        <w:t xml:space="preserve">purchase order.</w:t>
+        <w:t xml:space="preserve"> The system prints one sticker per individual product, worked out from the purchase order.</w:t>
       </w:r>
     </w:p>
     <w:p>
@@ -1608,28 +1200,7 @@
         <w:t xml:space="preserve">Stop:</w:t>
       </w:r>
       <w:r>
-        <w:t xml:space="preserve"> </w:t>
-      </w:r>
-      <w:r>
-        <w:t xml:space="preserve">the units scanned into a box must equal what the purchase order says</w:t>
-      </w:r>
-      <w:r>
-        <w:t xml:space="preserve"> </w:t>
-      </w:r>
-      <w:r>
-        <w:t xml:space="preserve">should be in it. Scanning too many is refused immediately. Scanning too few</w:t>
-      </w:r>
-      <w:r>
-        <w:t xml:space="preserve"> </w:t>
-      </w:r>
-      <w:r>
-        <w:t xml:space="preserve">holds that box — nothing in it moves — and logs a problem against the vendor and</w:t>
-      </w:r>
-      <w:r>
-        <w:t xml:space="preserve"> </w:t>
-      </w:r>
-      <w:r>
-        <w:t xml:space="preserve">the PO.</w:t>
+        <w:t xml:space="preserve"> the units scanned into a box must equal what the purchase order says should be in it. Scanning too many is refused immediately. Scanning too few holds that box — nothing in it moves — and logs a problem against the vendor and the PO.</w:t>
       </w:r>
     </w:p>
     <w:p>
@@ -1644,16 +1215,7 @@
         <w:t xml:space="preserve">Step 9 — A manager decides any held box.</w:t>
       </w:r>
       <w:r>
-        <w:t xml:space="preserve"> </w:t>
-      </w:r>
-      <w:r>
-        <w:t xml:space="preserve">Accept the shortfall, order a recount, or reject the goods. Whatever is decided,</w:t>
-      </w:r>
-      <w:r>
-        <w:t xml:space="preserve"> </w:t>
-      </w:r>
-      <w:r>
-        <w:t xml:space="preserve">the scans already taken are kept as evidence.</w:t>
+        <w:t xml:space="preserve"> Accept the shortfall, order a recount, or reject the goods. Whatever is decided, the scans already taken are kept as evidence.</w:t>
       </w:r>
     </w:p>
     <w:p>
@@ -1668,16 +1230,7 @@
         <w:t xml:space="preserve">Step 10 — Damage check and box closed.</w:t>
       </w:r>
       <w:r>
-        <w:t xml:space="preserve"> </w:t>
-      </w:r>
-      <w:r>
-        <w:t xml:space="preserve">The person scanning answers whether the goods are damaged before the box can be</w:t>
-      </w:r>
-      <w:r>
-        <w:t xml:space="preserve"> </w:t>
-      </w:r>
-      <w:r>
-        <w:t xml:space="preserve">closed.</w:t>
+        <w:t xml:space="preserve"> The person scanning answers whether the goods are damaged before the box can be closed.</w:t>
       </w:r>
     </w:p>
     <w:p>
@@ -1692,13 +1245,7 @@
         <w:t xml:space="preserve">Step 11 — Inbound reconciliation.</w:t>
       </w:r>
       <w:r>
-        <w:t xml:space="preserve"> </w:t>
-      </w:r>
-      <w:r>
-        <w:t xml:space="preserve">The offloading team enters their own count, arrived at independently.</w:t>
-      </w:r>
-      <w:r>
-        <w:t xml:space="preserve"> </w:t>
+        <w:t xml:space="preserve"> The offloading team enters their own count, arrived at independently. </w:t>
       </w:r>
       <w:r>
         <w:rPr>
@@ -1708,16 +1255,7 @@
         <w:t xml:space="preserve">Stop:</w:t>
       </w:r>
       <w:r>
-        <w:t xml:space="preserve"> </w:t>
-      </w:r>
-      <w:r>
-        <w:t xml:space="preserve">the two counts must agree. If they do, the truck’s entry closes and receiving is</w:t>
-      </w:r>
-      <w:r>
-        <w:t xml:space="preserve"> </w:t>
-      </w:r>
-      <w:r>
-        <w:t xml:space="preserve">complete. If they do not, the entry stays open and a problem is raised.</w:t>
+        <w:t xml:space="preserve"> the two counts must agree. If they do, the truck’s entry closes and receiving is complete. If they do not, the entry stays open and a problem is raised.</w:t>
       </w:r>
     </w:p>
     <w:bookmarkEnd w:id="21"/>
@@ -1742,22 +1280,7 @@
         <w:t xml:space="preserve">Step 12 — The invoice is captured.</w:t>
       </w:r>
       <w:r>
-        <w:t xml:space="preserve"> </w:t>
-      </w:r>
-      <w:r>
-        <w:t xml:space="preserve">A packer photographs the printed invoice. The app reads the order number off the</w:t>
-      </w:r>
-      <w:r>
-        <w:t xml:space="preserve"> </w:t>
-      </w:r>
-      <w:r>
-        <w:t xml:space="preserve">photograph and creates the invoice from it — no typing, no transcription</w:t>
-      </w:r>
-      <w:r>
-        <w:t xml:space="preserve"> </w:t>
-      </w:r>
-      <w:r>
-        <w:t xml:space="preserve">mistakes. (If the camera cannot manage it, the number can be typed.)</w:t>
+        <w:t xml:space="preserve"> A packer photographs the printed invoice. The app reads the order number off the photograph and creates the invoice from it — no typing, no transcription mistakes. (If the camera cannot manage it, the number can be typed.)</w:t>
       </w:r>
     </w:p>
     <w:p>
@@ -1772,13 +1295,7 @@
         <w:t xml:space="preserve">Step 13 — The carton is handed over.</w:t>
       </w:r>
       <w:r>
-        <w:t xml:space="preserve"> </w:t>
-      </w:r>
-      <w:r>
-        <w:t xml:space="preserve">The person holding it scans a</w:t>
-      </w:r>
-      <w:r>
-        <w:t xml:space="preserve"> </w:t>
+        <w:t xml:space="preserve"> The person holding it scans a </w:t>
       </w:r>
       <w:r>
         <w:rPr>
@@ -1788,19 +1305,7 @@
         <w:t xml:space="preserve">different</w:t>
       </w:r>
       <w:r>
-        <w:t xml:space="preserve"> </w:t>
-      </w:r>
-      <w:r>
-        <w:t xml:space="preserve">packing lady’s badge card to hand it</w:t>
-      </w:r>
-      <w:r>
-        <w:t xml:space="preserve"> </w:t>
-      </w:r>
-      <w:r>
-        <w:t xml:space="preserve">to her.</w:t>
-      </w:r>
-      <w:r>
-        <w:t xml:space="preserve"> </w:t>
+        <w:t xml:space="preserve"> packing lady’s badge card to hand it to her. </w:t>
       </w:r>
       <w:r>
         <w:rPr>
@@ -1810,16 +1315,7 @@
         <w:t xml:space="preserve">Stop:</w:t>
       </w:r>
       <w:r>
-        <w:t xml:space="preserve"> </w:t>
-      </w:r>
-      <w:r>
-        <w:t xml:space="preserve">scanning your own badge here is refused. The card is physically</w:t>
-      </w:r>
-      <w:r>
-        <w:t xml:space="preserve"> </w:t>
-      </w:r>
-      <w:r>
-        <w:t xml:space="preserve">in her hand, standing there — that is the point.</w:t>
+        <w:t xml:space="preserve"> scanning your own badge here is refused. The card is physically in her hand, standing there — that is the point.</w:t>
       </w:r>
     </w:p>
     <w:p>
@@ -1844,22 +1340,7 @@
         <w:t xml:space="preserve">Stop:</w:t>
       </w:r>
       <w:r>
-        <w:t xml:space="preserve"> </w:t>
-      </w:r>
-      <w:r>
-        <w:t xml:space="preserve">she must be a packer, she must hold a live badge, she must not be the</w:t>
-      </w:r>
-      <w:r>
-        <w:t xml:space="preserve"> </w:t>
-      </w:r>
-      <w:r>
-        <w:t xml:space="preserve">person who verified the invoice, and she must not already be in the middle of</w:t>
-      </w:r>
-      <w:r>
-        <w:t xml:space="preserve"> </w:t>
-      </w:r>
-      <w:r>
-        <w:t xml:space="preserve">another carton.</w:t>
+        <w:t xml:space="preserve"> she must be a packer, she must hold a live badge, she must not be the person who verified the invoice, and she must not already be in the middle of another carton.</w:t>
       </w:r>
     </w:p>
     <w:p>
@@ -1874,22 +1355,7 @@
         <w:t xml:space="preserve">Step 15 — She packs it.</w:t>
       </w:r>
       <w:r>
-        <w:t xml:space="preserve"> </w:t>
-      </w:r>
-      <w:r>
-        <w:t xml:space="preserve">She scans each product box into the carton. A double scan, a big-box sticker in</w:t>
-      </w:r>
-      <w:r>
-        <w:t xml:space="preserve"> </w:t>
-      </w:r>
-      <w:r>
-        <w:t xml:space="preserve">place of a product, a wrong product for that order, and a box that never arrived</w:t>
-      </w:r>
-      <w:r>
-        <w:t xml:space="preserve"> </w:t>
-      </w:r>
-      <w:r>
-        <w:t xml:space="preserve">are each refused with a message telling her which of those it was.</w:t>
+        <w:t xml:space="preserve"> She scans each product box into the carton. A double scan, a big-box sticker in place of a product, a wrong product for that order, and a box that never arrived are each refused with a message telling her which of those it was.</w:t>
       </w:r>
     </w:p>
     <w:p>
@@ -1914,22 +1380,7 @@
         <w:t xml:space="preserve">Stop:</w:t>
       </w:r>
       <w:r>
-        <w:t xml:space="preserve"> </w:t>
-      </w:r>
-      <w:r>
-        <w:t xml:space="preserve">the pack must be recorded against the person it was assigned to, and</w:t>
-      </w:r>
-      <w:r>
-        <w:t xml:space="preserve"> </w:t>
-      </w:r>
-      <w:r>
-        <w:t xml:space="preserve">that person must be different from the one who verified the invoice. The carton,</w:t>
-      </w:r>
-      <w:r>
-        <w:t xml:space="preserve"> </w:t>
-      </w:r>
-      <w:r>
-        <w:t xml:space="preserve">the invoice and the named person are now permanently linked, with the time.</w:t>
+        <w:t xml:space="preserve"> the pack must be recorded against the person it was assigned to, and that person must be different from the one who verified the invoice. The carton, the invoice and the named person are now permanently linked, with the time.</w:t>
       </w:r>
     </w:p>
     <w:p>
@@ -1944,19 +1395,7 @@
         <w:t xml:space="preserve">Step 17 — Out-scan into a batch.</w:t>
       </w:r>
       <w:r>
-        <w:t xml:space="preserve"> </w:t>
-      </w:r>
-      <w:r>
-        <w:t xml:space="preserve">A manager selects packed cartons into a despatch batch and scans each carton’s</w:t>
-      </w:r>
-      <w:r>
-        <w:t xml:space="preserve"> </w:t>
-      </w:r>
-      <w:r>
-        <w:t xml:space="preserve">invoice label.</w:t>
-      </w:r>
-      <w:r>
-        <w:t xml:space="preserve"> </w:t>
+        <w:t xml:space="preserve"> A manager selects packed cartons into a despatch batch and scans each carton’s invoice label. </w:t>
       </w:r>
       <w:r>
         <w:rPr>
@@ -1966,22 +1405,7 @@
         <w:t xml:space="preserve">Stop:</w:t>
       </w:r>
       <w:r>
-        <w:t xml:space="preserve"> </w:t>
-      </w:r>
-      <w:r>
-        <w:t xml:space="preserve">the batch cannot be completed while even one of its</w:t>
-      </w:r>
-      <w:r>
-        <w:t xml:space="preserve"> </w:t>
-      </w:r>
-      <w:r>
-        <w:t xml:space="preserve">cartons is unscanned. Once scanning starts, cartons cannot be quietly removed</w:t>
-      </w:r>
-      <w:r>
-        <w:t xml:space="preserve"> </w:t>
-      </w:r>
-      <w:r>
-        <w:t xml:space="preserve">from the batch.</w:t>
+        <w:t xml:space="preserve"> the batch cannot be completed while even one of its cartons is unscanned. Once scanning starts, cartons cannot be quietly removed from the batch.</w:t>
       </w:r>
     </w:p>
     <w:p>
@@ -1996,46 +1420,17 @@
         <w:t xml:space="preserve">Step 18 — The guard counts the cartons on the bay.</w:t>
       </w:r>
       <w:r>
-        <w:t xml:space="preserve"> </w:t>
-      </w:r>
-      <w:r>
-        <w:t xml:space="preserve">He types how many cartons are physically in front of him.</w:t>
-      </w:r>
-      <w:r>
-        <w:t xml:space="preserve"> </w:t>
-      </w:r>
-      <w:r>
-        <w:rPr>
-          <w:b/>
-          <w:bCs/>
-        </w:rPr>
-        <w:t xml:space="preserve">The system’s own</w:t>
-      </w:r>
-      <w:r>
-        <w:rPr>
-          <w:b/>
-          <w:bCs/>
-        </w:rPr>
-        <w:t xml:space="preserve"> </w:t>
-      </w:r>
-      <w:r>
-        <w:rPr>
-          <w:b/>
-          <w:bCs/>
-        </w:rPr>
-        <w:t xml:space="preserve">number is shown only after he commits to his</w:t>
-      </w:r>
-      <w:r>
-        <w:t xml:space="preserve"> </w:t>
-      </w:r>
-      <w:r>
-        <w:t xml:space="preserve">— so he cannot simply copy it. A</w:t>
-      </w:r>
-      <w:r>
-        <w:t xml:space="preserve"> </w:t>
-      </w:r>
-      <w:r>
-        <w:t xml:space="preserve">mismatch is flagged.</w:t>
+        <w:t xml:space="preserve"> He types how many cartons are physically in front of him. </w:t>
+      </w:r>
+      <w:r>
+        <w:rPr>
+          <w:b/>
+          <w:bCs/>
+        </w:rPr>
+        <w:t xml:space="preserve">The system’s own number is shown only after he commits to his</w:t>
+      </w:r>
+      <w:r>
+        <w:t xml:space="preserve"> — so he cannot simply copy it. A mismatch is flagged.</w:t>
       </w:r>
     </w:p>
     <w:p>
@@ -2060,16 +1455,7 @@
         <w:t xml:space="preserve">Stop:</w:t>
       </w:r>
       <w:r>
-        <w:t xml:space="preserve"> </w:t>
-      </w:r>
-      <w:r>
-        <w:t xml:space="preserve">the guard who counted cannot approve his own count, and the approver</w:t>
-      </w:r>
-      <w:r>
-        <w:t xml:space="preserve"> </w:t>
-      </w:r>
-      <w:r>
-        <w:t xml:space="preserve">must be a manager or Admin. Nothing is released for loading until this is done.</w:t>
+        <w:t xml:space="preserve"> the guard who counted cannot approve his own count, and the approver must be a manager or Admin. Nothing is released for loading until this is done.</w:t>
       </w:r>
     </w:p>
     <w:p>
@@ -2084,10 +1470,7 @@
         <w:t xml:space="preserve">Step 20 — The batch is released.</w:t>
       </w:r>
       <w:r>
-        <w:t xml:space="preserve"> </w:t>
-      </w:r>
-      <w:r>
-        <w:t xml:space="preserve">The invoices close. The floor can no longer act on them.</w:t>
+        <w:t xml:space="preserve"> The invoices close. The floor can no longer act on them.</w:t>
       </w:r>
     </w:p>
     <w:p>
@@ -2102,16 +1485,7 @@
         <w:t xml:space="preserve">Step 21 — The collecting vehicle is registered.</w:t>
       </w:r>
       <w:r>
-        <w:t xml:space="preserve"> </w:t>
-      </w:r>
-      <w:r>
-        <w:t xml:space="preserve">Same details as at entry. A driver who also delivered earlier is recognised and</w:t>
-      </w:r>
-      <w:r>
-        <w:t xml:space="preserve"> </w:t>
-      </w:r>
-      <w:r>
-        <w:t xml:space="preserve">not photographed again.</w:t>
+        <w:t xml:space="preserve"> Same details as at entry. A driver who also delivered earlier is recognised and not photographed again.</w:t>
       </w:r>
     </w:p>
     <w:p>
@@ -2126,13 +1500,7 @@
         <w:t xml:space="preserve">Step 22 — Cartons are loaded and verified.</w:t>
       </w:r>
       <w:r>
-        <w:t xml:space="preserve"> </w:t>
-      </w:r>
-      <w:r>
-        <w:t xml:space="preserve">The guard scans each carton onto the vehicle.</w:t>
-      </w:r>
-      <w:r>
-        <w:t xml:space="preserve"> </w:t>
+        <w:t xml:space="preserve"> The guard scans each carton onto the vehicle. </w:t>
       </w:r>
       <w:r>
         <w:rPr>
@@ -2142,16 +1510,7 @@
         <w:t xml:space="preserve">Stop:</w:t>
       </w:r>
       <w:r>
-        <w:t xml:space="preserve"> </w:t>
-      </w:r>
-      <w:r>
-        <w:t xml:space="preserve">every released carton must</w:t>
-      </w:r>
-      <w:r>
-        <w:t xml:space="preserve"> </w:t>
-      </w:r>
-      <w:r>
-        <w:t xml:space="preserve">be scanned on. One missing, and the vehicle cannot leave.</w:t>
+        <w:t xml:space="preserve"> every released carton must be scanned on. One missing, and the vehicle cannot leave.</w:t>
       </w:r>
     </w:p>
     <w:p>
@@ -2188,16 +1547,7 @@
         <w:t xml:space="preserve">Step 24 — A manager approves the exit.</w:t>
       </w:r>
       <w:r>
-        <w:t xml:space="preserve"> </w:t>
-      </w:r>
-      <w:r>
-        <w:t xml:space="preserve">Or holds it with a reason — and that reason appears on the guard’s screen, so he</w:t>
-      </w:r>
-      <w:r>
-        <w:t xml:space="preserve"> </w:t>
-      </w:r>
-      <w:r>
-        <w:t xml:space="preserve">knows what to do next rather than simply being refused.</w:t>
+        <w:t xml:space="preserve"> Or holds it with a reason — and that reason appears on the guard’s screen, so he knows what to do next rather than simply being refused.</w:t>
       </w:r>
     </w:p>
     <w:p>
@@ -2212,13 +1562,7 @@
         <w:t xml:space="preserve">Step 25 — The guard opens the gate.</w:t>
       </w:r>
       <w:r>
-        <w:t xml:space="preserve"> </w:t>
-      </w:r>
-      <w:r>
-        <w:t xml:space="preserve">The time out is stamped. Note that approving does</w:t>
-      </w:r>
-      <w:r>
-        <w:t xml:space="preserve"> </w:t>
+        <w:t xml:space="preserve"> The time out is stamped. Note that approving does </w:t>
       </w:r>
       <w:r>
         <w:rPr>
@@ -2228,16 +1572,7 @@
         <w:t xml:space="preserve">not</w:t>
       </w:r>
       <w:r>
-        <w:t xml:space="preserve"> </w:t>
-      </w:r>
-      <w:r>
-        <w:t xml:space="preserve">open the gate: the</w:t>
-      </w:r>
-      <w:r>
-        <w:t xml:space="preserve"> </w:t>
-      </w:r>
-      <w:r>
-        <w:t xml:space="preserve">guard does, so the physical act stays attached to the person standing there.</w:t>
+        <w:t xml:space="preserve"> open the gate: the guard does, so the physical act stays attached to the person standing there.</w:t>
       </w:r>
     </w:p>
     <w:p>
@@ -2263,19 +1598,7 @@
         <w:pStyle w:val="FirstParagraph"/>
       </w:pPr>
       <w:r>
-        <w:t xml:space="preserve">None of these can be overridden from inside the application. There is no</w:t>
-      </w:r>
-      <w:r>
-        <w:t xml:space="preserve"> </w:t>
-      </w:r>
-      <w:r>
-        <w:t xml:space="preserve">override button, no admin escape hatch, and no way to reach the next step by</w:t>
-      </w:r>
-      <w:r>
-        <w:t xml:space="preserve"> </w:t>
-      </w:r>
-      <w:r>
-        <w:t xml:space="preserve">clicking a different path.</w:t>
+        <w:t xml:space="preserve">None of these can be overridden from inside the application. There is no override button, no admin escape hatch, and no way to reach the next step by clicking a different path.</w:t>
       </w:r>
     </w:p>
     <w:tbl>
@@ -2726,34 +2049,7 @@
         <w:t xml:space="preserve">Why this matters technically:</w:t>
       </w:r>
       <w:r>
-        <w:t xml:space="preserve"> </w:t>
-      </w:r>
-      <w:r>
-        <w:t xml:space="preserve">each of these lives in the database as a rule,</w:t>
-      </w:r>
-      <w:r>
-        <w:t xml:space="preserve"> </w:t>
-      </w:r>
-      <w:r>
-        <w:t xml:space="preserve">not as a check in the application code. A rule written in application code is</w:t>
-      </w:r>
-      <w:r>
-        <w:t xml:space="preserve"> </w:t>
-      </w:r>
-      <w:r>
-        <w:t xml:space="preserve">one urgent hotfix away from not being a rule any more. The application still</w:t>
-      </w:r>
-      <w:r>
-        <w:t xml:space="preserve"> </w:t>
-      </w:r>
-      <w:r>
-        <w:t xml:space="preserve">checks too — that is where the friendly, actionable message comes from — but the</w:t>
-      </w:r>
-      <w:r>
-        <w:t xml:space="preserve"> </w:t>
-      </w:r>
-      <w:r>
-        <w:t xml:space="preserve">database is what makes it a guarantee.</w:t>
+        <w:t xml:space="preserve"> each of these lives in the database as a rule, not as a check in the application code. A rule written in application code is one urgent hotfix away from not being a rule any more. The application still checks too — that is where the friendly, actionable message comes from — but the database is what makes it a guarantee.</w:t>
       </w:r>
     </w:p>
     <w:p>
@@ -2873,13 +2169,7 @@
         </w:numPr>
       </w:pPr>
       <w:r>
-        <w:t xml:space="preserve">QR stickers printed for boxes and for individual products, in the exact</w:t>
-      </w:r>
-      <w:r>
-        <w:t xml:space="preserve"> </w:t>
-      </w:r>
-      <w:r>
-        <w:t xml:space="preserve">quantity required</w:t>
+        <w:t xml:space="preserve">QR stickers printed for boxes and for individual products, in the exact quantity required</w:t>
       </w:r>
     </w:p>
     <w:p>
@@ -2891,13 +2181,7 @@
         </w:numPr>
       </w:pPr>
       <w:r>
-        <w:t xml:space="preserve">Sticker sheets print correctly on ordinary office paper; badges print as</w:t>
-      </w:r>
-      <w:r>
-        <w:t xml:space="preserve"> </w:t>
-      </w:r>
-      <w:r>
-        <w:t xml:space="preserve">52 mm stickers</w:t>
+        <w:t xml:space="preserve">Sticker sheets print correctly on ordinary office paper; badges print as 52 mm stickers</w:t>
       </w:r>
     </w:p>
     <w:p>
@@ -2909,25 +2193,7 @@
         </w:numPr>
       </w:pPr>
       <w:r>
-        <w:t xml:space="preserve">Camera scanning on any phone, with a</w:t>
-      </w:r>
-      <w:r>
-        <w:t xml:space="preserve"> </w:t>
-      </w:r>
-      <w:r>
-        <w:t xml:space="preserve">“type the code instead”</w:t>
-      </w:r>
-      <w:r>
-        <w:t xml:space="preserve"> </w:t>
-      </w:r>
-      <w:r>
-        <w:t xml:space="preserve">field beside</w:t>
-      </w:r>
-      <w:r>
-        <w:t xml:space="preserve"> </w:t>
-      </w:r>
-      <w:r>
-        <w:t xml:space="preserve">every camera screen</w:t>
+        <w:t xml:space="preserve">Camera scanning on any phone, with a “type the code instead” field beside every camera screen</w:t>
       </w:r>
     </w:p>
     <w:p>
@@ -2939,19 +2205,7 @@
         </w:numPr>
       </w:pPr>
       <w:r>
-        <w:t xml:space="preserve">Every rejected scan is recorded with the reason, so</w:t>
-      </w:r>
-      <w:r>
-        <w:t xml:space="preserve"> </w:t>
-      </w:r>
-      <w:r>
-        <w:t xml:space="preserve">“the scanner didn’t work”</w:t>
-      </w:r>
-      <w:r>
-        <w:t xml:space="preserve"> </w:t>
-      </w:r>
-      <w:r>
-        <w:t xml:space="preserve">stays a claim that can be checked</w:t>
+        <w:t xml:space="preserve">Every rejected scan is recorded with the reason, so “the scanner didn’t work” stays a claim that can be checked</w:t>
       </w:r>
     </w:p>
     <w:p>
@@ -2963,13 +2217,7 @@
         </w:numPr>
       </w:pPr>
       <w:r>
-        <w:t xml:space="preserve">Counts are always derived from the scan record and can never be typed in or</w:t>
-      </w:r>
-      <w:r>
-        <w:t xml:space="preserve"> </w:t>
-      </w:r>
-      <w:r>
-        <w:t xml:space="preserve">edited directly</w:t>
+        <w:t xml:space="preserve">Counts are always derived from the scan record and can never be typed in or edited directly</w:t>
       </w:r>
     </w:p>
     <w:bookmarkEnd w:id="26"/>
@@ -2991,13 +2239,7 @@
         </w:numPr>
       </w:pPr>
       <w:r>
-        <w:t xml:space="preserve">Invoice photographed and read automatically (OCR) — order number lifted off</w:t>
-      </w:r>
-      <w:r>
-        <w:t xml:space="preserve"> </w:t>
-      </w:r>
-      <w:r>
-        <w:t xml:space="preserve">the paper</w:t>
+        <w:t xml:space="preserve">Invoice photographed and read automatically (OCR) — order number lifted off the paper</w:t>
       </w:r>
     </w:p>
     <w:p>
@@ -3045,25 +2287,7 @@
         </w:numPr>
       </w:pPr>
       <w:r>
-        <w:t xml:space="preserve">Reassignment keeps both records, so</w:t>
-      </w:r>
-      <w:r>
-        <w:t xml:space="preserve"> </w:t>
-      </w:r>
-      <w:r>
-        <w:t xml:space="preserve">“who had this carton at 2:20pm”</w:t>
-      </w:r>
-      <w:r>
-        <w:t xml:space="preserve"> </w:t>
-      </w:r>
-      <w:r>
-        <w:t xml:space="preserve">stays</w:t>
-      </w:r>
-      <w:r>
-        <w:t xml:space="preserve"> </w:t>
-      </w:r>
-      <w:r>
-        <w:t xml:space="preserve">answerable</w:t>
+        <w:t xml:space="preserve">Reassignment keeps both records, so “who had this carton at 2:20pm” stays answerable</w:t>
       </w:r>
     </w:p>
     <w:p>
@@ -3121,10 +2345,7 @@
         </w:numPr>
       </w:pPr>
       <w:r>
-        <w:t xml:space="preserve">Approving a problem does</w:t>
-      </w:r>
-      <w:r>
-        <w:t xml:space="preserve"> </w:t>
+        <w:t xml:space="preserve">Approving a problem does </w:t>
       </w:r>
       <w:r>
         <w:rPr>
@@ -3134,16 +2355,7 @@
         <w:t xml:space="preserve">not</w:t>
       </w:r>
       <w:r>
-        <w:t xml:space="preserve"> </w:t>
-      </w:r>
-      <w:r>
-        <w:t xml:space="preserve">let anyone past a hard stop — the system</w:t>
-      </w:r>
-      <w:r>
-        <w:t xml:space="preserve"> </w:t>
-      </w:r>
-      <w:r>
-        <w:t xml:space="preserve">explains what would actually fix it</w:t>
+        <w:t xml:space="preserve"> let anyone past a hard stop — the system explains what would actually fix it</w:t>
       </w:r>
     </w:p>
     <w:p>
@@ -3184,22 +2396,7 @@
         <w:t xml:space="preserve">Dashboard:</w:t>
       </w:r>
       <w:r>
-        <w:t xml:space="preserve"> </w:t>
-      </w:r>
-      <w:r>
-        <w:t xml:space="preserve">trucks waiting for approval, overdue approvals, open problems,</w:t>
-      </w:r>
-      <w:r>
-        <w:t xml:space="preserve"> </w:t>
-      </w:r>
-      <w:r>
-        <w:t xml:space="preserve">held boxes, trucks on site, trucks and scans today, boxes closed today, and a</w:t>
-      </w:r>
-      <w:r>
-        <w:t xml:space="preserve"> </w:t>
-      </w:r>
-      <w:r>
-        <w:t xml:space="preserve">live activity list</w:t>
+        <w:t xml:space="preserve"> trucks waiting for approval, overdue approvals, open problems, held boxes, trucks on site, trucks and scans today, boxes closed today, and a live activity list</w:t>
       </w:r>
     </w:p>
     <w:p>
@@ -3218,10 +2415,7 @@
         <w:t xml:space="preserve">Vendor accuracy</w:t>
       </w:r>
       <w:r>
-        <w:t xml:space="preserve"> </w:t>
-      </w:r>
-      <w:r>
-        <w:t xml:space="preserve">— which vendors cause the most discrepancies</w:t>
+        <w:t xml:space="preserve"> — which vendors cause the most discrepancies</w:t>
       </w:r>
     </w:p>
     <w:p>
@@ -3240,16 +2434,7 @@
         <w:t xml:space="preserve">Operator productivity</w:t>
       </w:r>
       <w:r>
-        <w:t xml:space="preserve"> </w:t>
-      </w:r>
-      <w:r>
-        <w:t xml:space="preserve">— how much each person has completed, and how</w:t>
-      </w:r>
-      <w:r>
-        <w:t xml:space="preserve"> </w:t>
-      </w:r>
-      <w:r>
-        <w:t xml:space="preserve">accurately</w:t>
+        <w:t xml:space="preserve"> — how much each person has completed, and how accurately</w:t>
       </w:r>
     </w:p>
     <w:p>
@@ -3268,10 +2453,7 @@
         <w:t xml:space="preserve">Exception log</w:t>
       </w:r>
       <w:r>
-        <w:t xml:space="preserve"> </w:t>
-      </w:r>
-      <w:r>
-        <w:t xml:space="preserve">— every mismatch and what was decided</w:t>
+        <w:t xml:space="preserve"> — every mismatch and what was decided</w:t>
       </w:r>
     </w:p>
     <w:p>
@@ -3290,10 +2472,7 @@
         <w:t xml:space="preserve">Gate register</w:t>
       </w:r>
       <w:r>
-        <w:t xml:space="preserve"> </w:t>
-      </w:r>
-      <w:r>
-        <w:t xml:space="preserve">— everyone who entered and left</w:t>
+        <w:t xml:space="preserve"> — everyone who entered and left</w:t>
       </w:r>
     </w:p>
     <w:p>
@@ -3312,10 +2491,7 @@
         <w:t xml:space="preserve">Outbound register</w:t>
       </w:r>
       <w:r>
-        <w:t xml:space="preserve"> </w:t>
-      </w:r>
-      <w:r>
-        <w:t xml:space="preserve">— every order despatched</w:t>
+        <w:t xml:space="preserve"> — every order despatched</w:t>
       </w:r>
     </w:p>
     <w:p>
@@ -3334,10 +2510,7 @@
         <w:t xml:space="preserve">Daily activity</w:t>
       </w:r>
       <w:r>
-        <w:t xml:space="preserve"> </w:t>
-      </w:r>
-      <w:r>
-        <w:t xml:space="preserve">— a day’s summary</w:t>
+        <w:t xml:space="preserve"> — a day’s summary</w:t>
       </w:r>
     </w:p>
     <w:p>
@@ -3356,10 +2529,7 @@
         <w:t xml:space="preserve">Audit trail</w:t>
       </w:r>
       <w:r>
-        <w:t xml:space="preserve"> </w:t>
-      </w:r>
-      <w:r>
-        <w:t xml:space="preserve">— every action, who did it, and exactly when</w:t>
+        <w:t xml:space="preserve"> — every action, who did it, and exactly when</w:t>
       </w:r>
     </w:p>
     <w:bookmarkEnd w:id="29"/>
@@ -3429,10 +2599,7 @@
         </w:numPr>
       </w:pPr>
       <w:r>
-        <w:t xml:space="preserve">Reissue a badge — which</w:t>
-      </w:r>
-      <w:r>
-        <w:t xml:space="preserve"> </w:t>
+        <w:t xml:space="preserve">Reissue a badge — which </w:t>
       </w:r>
       <w:r>
         <w:rPr>
@@ -3442,16 +2609,7 @@
         <w:t xml:space="preserve">replaces</w:t>
       </w:r>
       <w:r>
-        <w:t xml:space="preserve"> </w:t>
-      </w:r>
-      <w:r>
-        <w:t xml:space="preserve">it, so a lost card stops working</w:t>
-      </w:r>
-      <w:r>
-        <w:t xml:space="preserve"> </w:t>
-      </w:r>
-      <w:r>
-        <w:t xml:space="preserve">immediately</w:t>
+        <w:t xml:space="preserve"> it, so a lost card stops working immediately</w:t>
       </w:r>
     </w:p>
     <w:p>
@@ -3485,13 +2643,7 @@
         </w:numPr>
       </w:pPr>
       <w:r>
-        <w:t xml:space="preserve">Built for mid-range Android phones: large touch targets, layout that wraps</w:t>
-      </w:r>
-      <w:r>
-        <w:t xml:space="preserve"> </w:t>
-      </w:r>
-      <w:r>
-        <w:t xml:space="preserve">instead of scrolling sideways, respects the notch and home bar</w:t>
+        <w:t xml:space="preserve">Built for mid-range Android phones: large touch targets, layout that wraps instead of scrolling sideways, respects the notch and home bar</w:t>
       </w:r>
     </w:p>
     <w:p>
@@ -3510,22 +2662,7 @@
         <w:t xml:space="preserve">Works offline:</w:t>
       </w:r>
       <w:r>
-        <w:t xml:space="preserve"> </w:t>
-      </w:r>
-      <w:r>
-        <w:t xml:space="preserve">scans queue on the device and send themselves when the</w:t>
-      </w:r>
-      <w:r>
-        <w:t xml:space="preserve"> </w:t>
-      </w:r>
-      <w:r>
-        <w:t xml:space="preserve">signal returns. Every scan carries its own unique id, so replaying it twice</w:t>
-      </w:r>
-      <w:r>
-        <w:t xml:space="preserve"> </w:t>
-      </w:r>
-      <w:r>
-        <w:t xml:space="preserve">changes nothing</w:t>
+        <w:t xml:space="preserve"> scans queue on the device and send themselves when the signal returns. Every scan carries its own unique id, so replaying it twice changes nothing</w:t>
       </w:r>
     </w:p>
     <w:p>
@@ -3537,13 +2674,7 @@
         </w:numPr>
       </w:pPr>
       <w:r>
-        <w:t xml:space="preserve">Installable as an app on Android and iOS, and works in a plain browser tab</w:t>
-      </w:r>
-      <w:r>
-        <w:t xml:space="preserve"> </w:t>
-      </w:r>
-      <w:r>
-        <w:t xml:space="preserve">otherwise</w:t>
+        <w:t xml:space="preserve">Installable as an app on Android and iOS, and works in a plain browser tab otherwise</w:t>
       </w:r>
     </w:p>
     <w:p>
@@ -3562,10 +2693,7 @@
         <w:t xml:space="preserve">Two languages:</w:t>
       </w:r>
       <w:r>
-        <w:t xml:space="preserve"> </w:t>
-      </w:r>
-      <w:r>
-        <w:t xml:space="preserve">English and Kannada</w:t>
+        <w:t xml:space="preserve"> English and Kannada</w:t>
       </w:r>
     </w:p>
     <w:p>
@@ -3589,10 +2717,7 @@
         </w:numPr>
       </w:pPr>
       <w:r>
-        <w:t xml:space="preserve">In-app notification bell</w:t>
-      </w:r>
-      <w:r>
-        <w:t xml:space="preserve"> </w:t>
+        <w:t xml:space="preserve">In-app notification bell </w:t>
       </w:r>
       <w:r>
         <w:rPr>
@@ -3602,16 +2727,7 @@
         <w:t xml:space="preserve">and</w:t>
       </w:r>
       <w:r>
-        <w:t xml:space="preserve"> </w:t>
-      </w:r>
-      <w:r>
-        <w:t xml:space="preserve">automatic email when something needs a</w:t>
-      </w:r>
-      <w:r>
-        <w:t xml:space="preserve"> </w:t>
-      </w:r>
-      <w:r>
-        <w:t xml:space="preserve">manager’s attention</w:t>
+        <w:t xml:space="preserve"> automatic email when something needs a manager’s attention</w:t>
       </w:r>
     </w:p>
     <w:p>
@@ -3779,21 +2895,18 @@
               <w:pStyle w:val="Compact"/>
             </w:pPr>
             <w:r>
-              <w:t xml:space="preserve">Supabase / PostgreSQL</w:t>
-            </w:r>
-          </w:p>
-        </w:tc>
-        <w:tc>
-          <w:tcPr/>
-          <w:p>
-            <w:pPr>
-              <w:pStyle w:val="Compact"/>
-            </w:pPr>
-            <w:r>
-              <w:t xml:space="preserve">Where the data lives —</w:t>
-            </w:r>
-            <w:r>
-              <w:t xml:space="preserve"> </w:t>
+              <w:t xml:space="preserve">PostgreSQL</w:t>
+            </w:r>
+          </w:p>
+        </w:tc>
+        <w:tc>
+          <w:tcPr/>
+          <w:p>
+            <w:pPr>
+              <w:pStyle w:val="Compact"/>
+            </w:pPr>
+            <w:r>
+              <w:t xml:space="preserve">Where the data lives — </w:t>
             </w:r>
             <w:r>
               <w:rPr>
@@ -3824,7 +2937,7 @@
               <w:pStyle w:val="Compact"/>
             </w:pPr>
             <w:r>
-              <w:t xml:space="preserve">Supabase Auth</w:t>
+              <w:t xml:space="preserve">Token-based sign-in (JWT)</w:t>
             </w:r>
           </w:p>
         </w:tc>
@@ -3859,7 +2972,7 @@
               <w:pStyle w:val="Compact"/>
             </w:pPr>
             <w:r>
-              <w:t xml:space="preserve">Supabase Storage</w:t>
+              <w:t xml:space="preserve">Private file storage</w:t>
             </w:r>
           </w:p>
         </w:tc>
@@ -3929,18 +3042,18 @@
               <w:pStyle w:val="Compact"/>
             </w:pPr>
             <w:r>
-              <w:t xml:space="preserve">Render (back end), Vercel (front end)</w:t>
-            </w:r>
-          </w:p>
-        </w:tc>
-        <w:tc>
-          <w:tcPr/>
-          <w:p>
-            <w:pPr>
-              <w:pStyle w:val="Compact"/>
-            </w:pPr>
-            <w:r>
-              <w:t xml:space="preserve">Where it runs in production</w:t>
+              <w:t xml:space="preserve">Localhost (development machine)</w:t>
+            </w:r>
+          </w:p>
+        </w:tc>
+        <w:tc>
+          <w:tcPr/>
+          <w:p>
+            <w:pPr>
+              <w:pStyle w:val="Compact"/>
+            </w:pPr>
+            <w:r>
+              <w:t xml:space="preserve">Where it runs today — not deployed yet</w:t>
             </w:r>
           </w:p>
         </w:tc>
@@ -3973,16 +3086,7 @@
         <w:t xml:space="preserve">The hard stops live in the database.</w:t>
       </w:r>
       <w:r>
-        <w:t xml:space="preserve"> </w:t>
-      </w:r>
-      <w:r>
-        <w:t xml:space="preserve">Not in the app. A rule in the</w:t>
-      </w:r>
-      <w:r>
-        <w:t xml:space="preserve"> </w:t>
-      </w:r>
-      <w:r>
-        <w:t xml:space="preserve">database cannot be bypassed by a bug, a shortcut, or an urgent patch.</w:t>
+        <w:t xml:space="preserve"> Not in the app. A rule in the database cannot be bypassed by a bug, a shortcut, or an urgent patch.</w:t>
       </w:r>
     </w:p>
     <w:p>
@@ -4000,22 +3104,7 @@
         <w:t xml:space="preserve">Permissions are checked inside the database too.</w:t>
       </w:r>
       <w:r>
-        <w:t xml:space="preserve"> </w:t>
-      </w:r>
-      <w:r>
-        <w:t xml:space="preserve">Every request runs as</w:t>
-      </w:r>
-      <w:r>
-        <w:t xml:space="preserve"> </w:t>
-      </w:r>
-      <w:r>
-        <w:t xml:space="preserve">the person who made it, so even a route that forgot to check a permission</w:t>
-      </w:r>
-      <w:r>
-        <w:t xml:space="preserve"> </w:t>
-      </w:r>
-      <w:r>
-        <w:t xml:space="preserve">still cannot read data belonging to someone else.</w:t>
+        <w:t xml:space="preserve"> Every request runs as the person who made it, so even a route that forgot to check a permission still cannot read data belonging to someone else.</w:t>
       </w:r>
     </w:p>
     <w:p>
@@ -4033,46 +3122,7 @@
         <w:t xml:space="preserve">Counts are calculated, never written.</w:t>
       </w:r>
       <w:r>
-        <w:t xml:space="preserve"> </w:t>
-      </w:r>
-      <w:r>
-        <w:t xml:space="preserve">The</w:t>
-      </w:r>
-      <w:r>
-        <w:t xml:space="preserve"> </w:t>
-      </w:r>
-      <w:r>
-        <w:t xml:space="preserve">“units scanned”</w:t>
-      </w:r>
-      <w:r>
-        <w:t xml:space="preserve"> </w:t>
-      </w:r>
-      <w:r>
-        <w:t xml:space="preserve">figure on a box</w:t>
-      </w:r>
-      <w:r>
-        <w:t xml:space="preserve"> </w:t>
-      </w:r>
-      <w:r>
-        <w:t xml:space="preserve">is maintained only by the database as scans arrive, and refuses to be set</w:t>
-      </w:r>
-      <w:r>
-        <w:t xml:space="preserve"> </w:t>
-      </w:r>
-      <w:r>
-        <w:t xml:space="preserve">directly. If the application could set that number,</w:t>
-      </w:r>
-      <w:r>
-        <w:t xml:space="preserve"> </w:t>
-      </w:r>
-      <w:r>
-        <w:t xml:space="preserve">“scanned equals expected”</w:t>
-      </w:r>
-      <w:r>
-        <w:t xml:space="preserve"> </w:t>
-      </w:r>
-      <w:r>
-        <w:t xml:space="preserve">would prove nothing at all.</w:t>
+        <w:t xml:space="preserve"> The “units scanned” figure on a box is maintained only by the database as scans arrive, and refuses to be set directly. If the application could set that number, “scanned equals expected” would prove nothing at all.</w:t>
       </w:r>
     </w:p>
     <w:p>
@@ -4101,13 +3151,7 @@
         </w:numPr>
       </w:pPr>
       <w:r>
-        <w:t xml:space="preserve">Every user is authenticated, and permissions are checked three times over:</w:t>
-      </w:r>
-      <w:r>
-        <w:t xml:space="preserve"> </w:t>
-      </w:r>
-      <w:r>
-        <w:t xml:space="preserve">when the menu is built, when the endpoint is called, and again by the database</w:t>
+        <w:t xml:space="preserve">Every user is authenticated, and permissions are checked three times over: when the menu is built, when the endpoint is called, and again by the database</w:t>
       </w:r>
     </w:p>
     <w:p>
@@ -4119,10 +3163,7 @@
         </w:numPr>
       </w:pPr>
       <w:r>
-        <w:t xml:space="preserve">Identity photos sit in a</w:t>
-      </w:r>
-      <w:r>
-        <w:t xml:space="preserve"> </w:t>
+        <w:t xml:space="preserve">Identity photos sit in a </w:t>
       </w:r>
       <w:r>
         <w:rPr>
@@ -4132,16 +3173,7 @@
         <w:t xml:space="preserve">private</w:t>
       </w:r>
       <w:r>
-        <w:t xml:space="preserve"> </w:t>
-      </w:r>
-      <w:r>
-        <w:t xml:space="preserve">bucket. The guard who uploads one cannot</w:t>
-      </w:r>
-      <w:r>
-        <w:t xml:space="preserve"> </w:t>
-      </w:r>
-      <w:r>
-        <w:t xml:space="preserve">read it back — it is a one-way drop box. Only Admin can view one</w:t>
+        <w:t xml:space="preserve"> bucket. The guard who uploads one cannot read it back — it is a one-way drop box. Only Admin can view one</w:t>
       </w:r>
     </w:p>
     <w:p>
@@ -4160,25 +3192,7 @@
         <w:t xml:space="preserve">Identity photos are destroyed after 180 days</w:t>
       </w:r>
       <w:r>
-        <w:t xml:space="preserve">, not merely hidden, by a</w:t>
-      </w:r>
-      <w:r>
-        <w:t xml:space="preserve"> </w:t>
-      </w:r>
-      <w:r>
-        <w:t xml:space="preserve">background job holding the only credential able to delete them. How far behind</w:t>
-      </w:r>
-      <w:r>
-        <w:t xml:space="preserve"> </w:t>
-      </w:r>
-      <w:r>
-        <w:t xml:space="preserve">that job is running is shown on the Staff screen, because a deletion job that</w:t>
-      </w:r>
-      <w:r>
-        <w:t xml:space="preserve"> </w:t>
-      </w:r>
-      <w:r>
-        <w:t xml:space="preserve">quietly stops breaks nothing visible</w:t>
+        <w:t xml:space="preserve">, not merely hidden, by a background job holding the only credential able to delete them. How far behind that job is running is shown on the Staff screen, because a deletion job that quietly stops breaks nothing visible</w:t>
       </w:r>
     </w:p>
     <w:p>
@@ -4197,22 +3211,7 @@
         <w:t xml:space="preserve">Badge codes never leave the database.</w:t>
       </w:r>
       <w:r>
-        <w:t xml:space="preserve"> </w:t>
-      </w:r>
-      <w:r>
-        <w:t xml:space="preserve">A badge code is only ever returned</w:t>
-      </w:r>
-      <w:r>
-        <w:t xml:space="preserve"> </w:t>
-      </w:r>
-      <w:r>
-        <w:t xml:space="preserve">once — to the Admin issuing it, for a badge created in that same moment. It</w:t>
-      </w:r>
-      <w:r>
-        <w:t xml:space="preserve"> </w:t>
-      </w:r>
-      <w:r>
-        <w:t xml:space="preserve">cannot be looked up afterwards, and it is stripped out of the audit trail</w:t>
+        <w:t xml:space="preserve"> A badge code is only ever returned once — to the Admin issuing it, for a badge created in that same moment. It cannot be looked up afterwards, and it is stripped out of the audit trail</w:t>
       </w:r>
     </w:p>
     <w:p>
@@ -4224,22 +3223,7 @@
         </w:numPr>
       </w:pPr>
       <w:r>
-        <w:t xml:space="preserve">Because of that,</w:t>
-      </w:r>
-      <w:r>
-        <w:t xml:space="preserve"> </w:t>
-      </w:r>
-      <w:r>
-        <w:t xml:space="preserve">“reissue”</w:t>
-      </w:r>
-      <w:r>
-        <w:t xml:space="preserve"> </w:t>
-      </w:r>
-      <w:r>
-        <w:t xml:space="preserve">means</w:t>
-      </w:r>
-      <w:r>
-        <w:t xml:space="preserve"> </w:t>
+        <w:t xml:space="preserve">Because of that, “reissue” means </w:t>
       </w:r>
       <w:r>
         <w:rPr>
@@ -4249,13 +3233,7 @@
         <w:t xml:space="preserve">replace</w:t>
       </w:r>
       <w:r>
-        <w:t xml:space="preserve">: a lost badge is never looked up,</w:t>
-      </w:r>
-      <w:r>
-        <w:t xml:space="preserve"> </w:t>
-      </w:r>
-      <w:r>
-        <w:t xml:space="preserve">and a found badge stops working the instant the replacement is printed</w:t>
+        <w:t xml:space="preserve">: a lost badge is never looked up, and a found badge stops working the instant the replacement is printed</w:t>
       </w:r>
     </w:p>
     <w:p>
@@ -4267,19 +3245,7 @@
         </w:numPr>
       </w:pPr>
       <w:r>
-        <w:t xml:space="preserve">A formal security review was carried out and its five findings fixed,</w:t>
-      </w:r>
-      <w:r>
-        <w:t xml:space="preserve"> </w:t>
-      </w:r>
-      <w:r>
-        <w:t xml:space="preserve">including a manager who could have promoted themselves to Admin and an</w:t>
-      </w:r>
-      <w:r>
-        <w:t xml:space="preserve"> </w:t>
-      </w:r>
-      <w:r>
-        <w:t xml:space="preserve">unvalidated redirect after sign-in</w:t>
+        <w:t xml:space="preserve">A formal security review was carried out and its five findings fixed, including a manager who could have promoted themselves to Admin and an unvalidated redirect after sign-in</w:t>
       </w:r>
     </w:p>
     <w:p>
@@ -4291,25 +3257,7 @@
         </w:numPr>
       </w:pPr>
       <w:r>
-        <w:t xml:space="preserve">Two hardening items are consciously outstanding: a browser content-security</w:t>
-      </w:r>
-      <w:r>
-        <w:t xml:space="preserve"> </w:t>
-      </w:r>
-      <w:r>
-        <w:t xml:space="preserve">policy (which can only be written once the production web addresses are</w:t>
-      </w:r>
-      <w:r>
-        <w:t xml:space="preserve"> </w:t>
-      </w:r>
-      <w:r>
-        <w:t xml:space="preserve">settled) and application-level rate limiting (sign-in is already rate-limited</w:t>
-      </w:r>
-      <w:r>
-        <w:t xml:space="preserve"> </w:t>
-      </w:r>
-      <w:r>
-        <w:t xml:space="preserve">by the authentication provider)</w:t>
+        <w:t xml:space="preserve">Two hardening items are consciously outstanding: a browser content-security policy (which can only be written once the final web addresses are settled) and application-level rate limiting (sign-in is already rate-limited)</w:t>
       </w:r>
     </w:p>
     <w:p>
@@ -4345,19 +3293,7 @@
         <w:t xml:space="preserve">167 automated tests</w:t>
       </w:r>
       <w:r>
-        <w:t xml:space="preserve"> </w:t>
-      </w:r>
-      <w:r>
-        <w:t xml:space="preserve">run against a real PostgreSQL database, because what</w:t>
-      </w:r>
-      <w:r>
-        <w:t xml:space="preserve"> </w:t>
-      </w:r>
-      <w:r>
-        <w:t xml:space="preserve">they are testing</w:t>
-      </w:r>
-      <w:r>
-        <w:t xml:space="preserve"> </w:t>
+        <w:t xml:space="preserve"> run against a real PostgreSQL database, because what they are testing </w:t>
       </w:r>
       <w:r>
         <w:rPr>
@@ -4367,16 +3303,7 @@
         <w:t xml:space="preserve">is</w:t>
       </w:r>
       <w:r>
-        <w:t xml:space="preserve"> </w:t>
-      </w:r>
-      <w:r>
-        <w:t xml:space="preserve">the database: the hard stops, the constraints, and the</w:t>
-      </w:r>
-      <w:r>
-        <w:t xml:space="preserve"> </w:t>
-      </w:r>
-      <w:r>
-        <w:t xml:space="preserve">permission rules</w:t>
+        <w:t xml:space="preserve"> the database: the hard stops, the constraints, and the permission rules</w:t>
       </w:r>
     </w:p>
     <w:p>
@@ -4395,34 +3322,7 @@
         <w:t xml:space="preserve">A full end-to-end walkthrough (122 checks)</w:t>
       </w:r>
       <w:r>
-        <w:t xml:space="preserve"> </w:t>
-      </w:r>
-      <w:r>
-        <w:t xml:space="preserve">drives the real running</w:t>
-      </w:r>
-      <w:r>
-        <w:t xml:space="preserve"> </w:t>
-      </w:r>
-      <w:r>
-        <w:t xml:space="preserve">application over the network — truck registered, approved, admitted, counted,</w:t>
-      </w:r>
-      <w:r>
-        <w:t xml:space="preserve"> </w:t>
-      </w:r>
-      <w:r>
-        <w:t xml:space="preserve">stickered, scanned, closed, reconciled; carton invoiced, assigned, packed,</w:t>
-      </w:r>
-      <w:r>
-        <w:t xml:space="preserve"> </w:t>
-      </w:r>
-      <w:r>
-        <w:t xml:space="preserve">batched, out-scanned, counted, released, loaded and driven out — with each</w:t>
-      </w:r>
-      <w:r>
-        <w:t xml:space="preserve"> </w:t>
-      </w:r>
-      <w:r>
-        <w:t xml:space="preserve">step performed by the role whose button it actually is</w:t>
+        <w:t xml:space="preserve"> drives the real running application over the network — truck registered, approved, admitted, counted, stickered, scanned, closed, reconciled; carton invoiced, assigned, packed, batched, out-scanned, counted, released, loaded and driven out — with each step performed by the role whose button it actually is</w:t>
       </w:r>
     </w:p>
     <w:p>
@@ -4441,28 +3341,7 @@
         <w:t xml:space="preserve">A role-access sweep (582 checks)</w:t>
       </w:r>
       <w:r>
-        <w:t xml:space="preserve"> </w:t>
-      </w:r>
-      <w:r>
-        <w:t xml:space="preserve">points every screen and every action at</w:t>
-      </w:r>
-      <w:r>
-        <w:t xml:space="preserve"> </w:t>
-      </w:r>
-      <w:r>
-        <w:t xml:space="preserve">all seven roles and confirms each one is either allowed or properly refused.</w:t>
-      </w:r>
-      <w:r>
-        <w:t xml:space="preserve"> </w:t>
-      </w:r>
-      <w:r>
-        <w:t xml:space="preserve">This catches the worst kind of bug on a warehouse floor: a button somebody can</w:t>
-      </w:r>
-      <w:r>
-        <w:t xml:space="preserve"> </w:t>
-      </w:r>
-      <w:r>
-        <w:t xml:space="preserve">press that can only ever fail, which looks identical to a broken app</w:t>
+        <w:t xml:space="preserve"> points every screen and every action at all seven roles and confirms each one is either allowed or properly refused. This catches the worst kind of bug on a warehouse floor: a button somebody can press that can only ever fail, which looks identical to a broken app</w:t>
       </w:r>
     </w:p>
     <w:p>
@@ -4481,46 +3360,17 @@
         <w:t xml:space="preserve">An admin walkthrough (40 checks)</w:t>
       </w:r>
       <w:r>
-        <w:t xml:space="preserve"> </w:t>
-      </w:r>
-      <w:r>
-        <w:t xml:space="preserve">and</w:t>
-      </w:r>
-      <w:r>
-        <w:t xml:space="preserve"> </w:t>
-      </w:r>
-      <w:r>
-        <w:rPr>
-          <w:b/>
-          <w:bCs/>
-        </w:rPr>
-        <w:t xml:space="preserve">a photo-retention check (14</w:t>
-      </w:r>
-      <w:r>
-        <w:rPr>
-          <w:b/>
-          <w:bCs/>
-        </w:rPr>
-        <w:t xml:space="preserve"> </w:t>
-      </w:r>
-      <w:r>
-        <w:rPr>
-          <w:b/>
-          <w:bCs/>
-        </w:rPr>
-        <w:t xml:space="preserve">checks)</w:t>
-      </w:r>
-      <w:r>
-        <w:t xml:space="preserve"> </w:t>
-      </w:r>
-      <w:r>
-        <w:t xml:space="preserve">confirm that accounts created on screen can really sign in, and that</w:t>
-      </w:r>
-      <w:r>
-        <w:t xml:space="preserve"> </w:t>
-      </w:r>
-      <w:r>
-        <w:t xml:space="preserve">an expired identity photo really does leave storage</w:t>
+        <w:t xml:space="preserve"> and </w:t>
+      </w:r>
+      <w:r>
+        <w:rPr>
+          <w:b/>
+          <w:bCs/>
+        </w:rPr>
+        <w:t xml:space="preserve">a photo-retention check (14 checks)</w:t>
+      </w:r>
+      <w:r>
+        <w:t xml:space="preserve"> confirm that accounts created on screen can really sign in, and that an expired identity photo really does leave storage</w:t>
       </w:r>
     </w:p>
     <w:p>
@@ -4532,13 +3382,7 @@
         </w:numPr>
       </w:pPr>
       <w:r>
-        <w:t xml:space="preserve">Every test creates the records it needs and removes them afterwards, so the</w:t>
-      </w:r>
-      <w:r>
-        <w:t xml:space="preserve"> </w:t>
-      </w:r>
-      <w:r>
-        <w:t xml:space="preserve">suite does not depend on whatever state the database happens to be in</w:t>
+        <w:t xml:space="preserve">Every test creates the records it needs and removes them afterwards, so the suite does not depend on whatever state the database happens to be in</w:t>
       </w:r>
     </w:p>
     <w:p>
@@ -4606,10 +3450,7 @@
         </w:numPr>
       </w:pPr>
       <w:r>
-        <w:t xml:space="preserve">The damage</w:t>
-      </w:r>
-      <w:r>
-        <w:t xml:space="preserve"> </w:t>
+        <w:t xml:space="preserve">The damage </w:t>
       </w:r>
       <w:r>
         <w:rPr>
@@ -4619,16 +3460,7 @@
         <w:t xml:space="preserve">claims</w:t>
       </w:r>
       <w:r>
-        <w:t xml:space="preserve"> </w:t>
-      </w:r>
-      <w:r>
-        <w:t xml:space="preserve">process — damage is recorded and photographed, but</w:t>
-      </w:r>
-      <w:r>
-        <w:t xml:space="preserve"> </w:t>
-      </w:r>
-      <w:r>
-        <w:t xml:space="preserve">pursuing the claim is done outside the app</w:t>
+        <w:t xml:space="preserve"> process — damage is recorded and photographed, but pursuing the claim is done outside the app</w:t>
       </w:r>
     </w:p>
     <w:p>
@@ -4676,13 +3508,7 @@
         </w:numPr>
       </w:pPr>
       <w:r>
-        <w:t xml:space="preserve">Putaway and rack locations. The app no longer tracks which shelf goods sit on,</w:t>
-      </w:r>
-      <w:r>
-        <w:t xml:space="preserve"> </w:t>
-      </w:r>
-      <w:r>
-        <w:t xml:space="preserve">so receiving now ends at the inbound reconciliation step</w:t>
+        <w:t xml:space="preserve">Putaway and rack locations. The app no longer tracks which shelf goods sit on, so receiving now ends at the inbound reconciliation step</w:t>
       </w:r>
     </w:p>
     <w:p>
@@ -4713,22 +3539,7 @@
         <w:t xml:space="preserve">Push notifications.</w:t>
       </w:r>
       <w:r>
-        <w:t xml:space="preserve"> </w:t>
-      </w:r>
-      <w:r>
-        <w:t xml:space="preserve">Managers are alerted by in-app notification and by</w:t>
-      </w:r>
-      <w:r>
-        <w:t xml:space="preserve"> </w:t>
-      </w:r>
-      <w:r>
-        <w:t xml:space="preserve">email. True phone push notifications — the kind that appear when the app is</w:t>
-      </w:r>
-      <w:r>
-        <w:t xml:space="preserve"> </w:t>
-      </w:r>
-      <w:r>
-        <w:t xml:space="preserve">closed — are the remaining item on the list</w:t>
+        <w:t xml:space="preserve"> Managers are alerted by in-app notification and by email. True phone push notifications — the kind that appear when the app is closed — are the remaining item on the list</w:t>
       </w:r>
     </w:p>
     <w:p>
@@ -4747,22 +3558,7 @@
         <w:t xml:space="preserve">A final visual design pass.</w:t>
       </w:r>
       <w:r>
-        <w:t xml:space="preserve"> </w:t>
-      </w:r>
-      <w:r>
-        <w:t xml:space="preserve">Every screen works and is usable on a phone,</w:t>
-      </w:r>
-      <w:r>
-        <w:t xml:space="preserve"> </w:t>
-      </w:r>
-      <w:r>
-        <w:t xml:space="preserve">but a last consistency pass over colours, spacing and styling was deliberately</w:t>
-      </w:r>
-      <w:r>
-        <w:t xml:space="preserve"> </w:t>
-      </w:r>
-      <w:r>
-        <w:t xml:space="preserve">left until after the working parts were right</w:t>
+        <w:t xml:space="preserve"> Every screen works and is usable on a phone, but a last consistency pass over colours, spacing and styling was deliberately left until after the working parts were right</w:t>
       </w:r>
     </w:p>
     <w:p>
@@ -4787,13 +3583,7 @@
         <w:pStyle w:val="FirstParagraph"/>
       </w:pPr>
       <w:r>
-        <w:t xml:space="preserve">A truck arrives. The guard writes down who is on it and asks permission. Someone</w:t>
-      </w:r>
-      <w:r>
-        <w:t xml:space="preserve"> </w:t>
-      </w:r>
-      <w:r>
-        <w:t xml:space="preserve">else — never the guard — says yes. The gate opens and the clock starts.</w:t>
+        <w:t xml:space="preserve">A truck arrives. The guard writes down who is on it and asks permission. Someone else — never the guard — says yes. The gate opens and the clock starts.</w:t>
       </w:r>
     </w:p>
     <w:p>
@@ -4801,37 +3591,7 @@
         <w:pStyle w:val="BodyText"/>
       </w:pPr>
       <w:r>
-        <w:t xml:space="preserve">The guard counts the boxes. The system prints exactly that many stickers. Every</w:t>
-      </w:r>
-      <w:r>
-        <w:t xml:space="preserve"> </w:t>
-      </w:r>
-      <w:r>
-        <w:t xml:space="preserve">box is stickered and scanned; if even one is missing, nothing moves inside. Every</w:t>
-      </w:r>
-      <w:r>
-        <w:t xml:space="preserve"> </w:t>
-      </w:r>
-      <w:r>
-        <w:t xml:space="preserve">product inside is stickered and scanned into its box; if the count is short, that</w:t>
-      </w:r>
-      <w:r>
-        <w:t xml:space="preserve"> </w:t>
-      </w:r>
-      <w:r>
-        <w:t xml:space="preserve">box is held and the vendor gets a problem logged against them. A manager decides</w:t>
-      </w:r>
-      <w:r>
-        <w:t xml:space="preserve"> </w:t>
-      </w:r>
-      <w:r>
-        <w:t xml:space="preserve">what happens to it. The offloading team enters their own count from their own</w:t>
-      </w:r>
-      <w:r>
-        <w:t xml:space="preserve"> </w:t>
-      </w:r>
-      <w:r>
-        <w:t xml:space="preserve">system; until the two agree, the truck’s paperwork does not close.</w:t>
+        <w:t xml:space="preserve">The guard counts the boxes. The system prints exactly that many stickers. Every box is stickered and scanned; if even one is missing, nothing moves inside. Every product inside is stickered and scanned into its box; if the count is short, that box is held and the vendor gets a problem logged against them. A manager decides what happens to it. The offloading team enters their own count from their own system; until the two agree, the truck’s paperwork does not close.</w:t>
       </w:r>
     </w:p>
     <w:p>
@@ -4839,37 +3599,7 @@
         <w:pStyle w:val="BodyText"/>
       </w:pPr>
       <w:r>
-        <w:t xml:space="preserve">On the way out: an invoice is photographed and read automatically. One person</w:t>
-      </w:r>
-      <w:r>
-        <w:t xml:space="preserve"> </w:t>
-      </w:r>
-      <w:r>
-        <w:t xml:space="preserve">hands the carton to another by scanning her badge — it must be a different</w:t>
-      </w:r>
-      <w:r>
-        <w:t xml:space="preserve"> </w:t>
-      </w:r>
-      <w:r>
-        <w:t xml:space="preserve">person. She packs it and signs for it with her own badge. Finished cartons are</w:t>
-      </w:r>
-      <w:r>
-        <w:t xml:space="preserve"> </w:t>
-      </w:r>
-      <w:r>
-        <w:t xml:space="preserve">scanned into a batch. The guard counts what is physically on the bay before he</w:t>
-      </w:r>
-      <w:r>
-        <w:t xml:space="preserve"> </w:t>
-      </w:r>
-      <w:r>
-        <w:t xml:space="preserve">is shown what the system thinks. A manager approves that count. The batch is</w:t>
-      </w:r>
-      <w:r>
-        <w:t xml:space="preserve"> </w:t>
-      </w:r>
-      <w:r>
-        <w:t xml:space="preserve">released.</w:t>
+        <w:t xml:space="preserve">On the way out: an invoice is photographed and read automatically. One person hands the carton to another by scanning her badge — it must be a different person. She packs it and signs for it with her own badge. Finished cartons are scanned into a batch. The guard counts what is physically on the bay before he is shown what the system thinks. A manager approves that count. The batch is released.</w:t>
       </w:r>
     </w:p>
     <w:p>
@@ -4877,19 +3607,7 @@
         <w:pStyle w:val="BodyText"/>
       </w:pPr>
       <w:r>
-        <w:t xml:space="preserve">The collecting vehicle is registered. Every carton is scanned onto it. The guard</w:t>
-      </w:r>
-      <w:r>
-        <w:t xml:space="preserve"> </w:t>
-      </w:r>
-      <w:r>
-        <w:t xml:space="preserve">asks permission to leave; a manager grants it or holds it with a reason. The</w:t>
-      </w:r>
-      <w:r>
-        <w:t xml:space="preserve"> </w:t>
-      </w:r>
-      <w:r>
-        <w:t xml:space="preserve">guard — not the manager — opens the gate, and the time out is stamped.</w:t>
+        <w:t xml:space="preserve">The collecting vehicle is registered. Every carton is scanned onto it. The guard asks permission to leave; a manager grants it or holds it with a reason. The guard — not the manager — opens the gate, and the time out is stamped.</w:t>
       </w:r>
     </w:p>
     <w:p>
@@ -4897,19 +3615,7 @@
         <w:pStyle w:val="BodyText"/>
       </w:pPr>
       <w:r>
-        <w:t xml:space="preserve">At every one of those eleven points, if the numbers do not agree, the system</w:t>
-      </w:r>
-      <w:r>
-        <w:t xml:space="preserve"> </w:t>
-      </w:r>
-      <w:r>
-        <w:t xml:space="preserve">does not ask for a supervisor’s password. It simply does not proceed, and it</w:t>
-      </w:r>
-      <w:r>
-        <w:t xml:space="preserve"> </w:t>
-      </w:r>
-      <w:r>
-        <w:t xml:space="preserve">writes down why.</w:t>
+        <w:t xml:space="preserve">At every one of those eleven points, if the numbers do not agree, the system does not ask for a supervisor’s password. It simply does not proceed, and it writes down why.</w:t>
       </w:r>
     </w:p>
     <w:bookmarkEnd w:id="37"/>

</xml_diff>